<commit_message>
Toán 10, 11: chuẩn hoá phông Times New Roman cỡ 12 cho các KHBD
Co-Authored-By: Claude Opus 5.5 <noreply@anthropic.com>
</commit_message>
<xml_diff>
--- a/mon/toan/khbd/lop10/KHBD_Bai1_MenhDe_Toan10_v4.docx
+++ b/mon/toan/khbd/lop10/KHBD_Bai1_MenhDe_Toan10_v4.docx
@@ -128,8 +128,8 @@
           <w:b/>
           <w:bCs/>
           <w:color w:val="FF0000"/>
-          <w:sz w:val="28"/>
-          <w:szCs w:val="28"/>
+          <w:sz w:val="24"/>
+          <w:szCs w:val="24"/>
         </w:rPr>
         <w:t>KẾ HOẠCH BÀI DẠY MÔN TOÁN LỚP 10</w:t>
       </w:r>
@@ -12513,7 +12513,7 @@
       <w:r>
         <w:rPr>
           <w:i/>
-          <w:sz w:val="20"/>
+          <w:sz w:val="24"/>
         </w:rPr>
         <w:t>Sơ đồ tư duy – Mệnh đề (TTT biên soạn theo SGK)</w:t>
       </w:r>
@@ -12649,8 +12649,8 @@
                 <w:b/>
                 <w:bCs/>
                 <w:color w:val="1F9E92"/>
-                <w:sz w:val="28"/>
-                <w:szCs w:val="28"/>
+                <w:sz w:val="24"/>
+                <w:szCs w:val="24"/>
               </w:rPr>
               <w:t>BÀI TRẮC NGHIỆM CỦNG CỐ ONLINE – BÀI 1</w:t>
             </w:r>
@@ -22670,8 +22670,8 @@
         <w:i/>
         <w:iCs/>
         <w:color w:val="404040"/>
-        <w:sz w:val="22"/>
-        <w:szCs w:val="22"/>
+        <w:sz w:val="24"/>
+        <w:szCs w:val="24"/>
       </w:rPr>
       <w:t>GV: TTT</w:t>
     </w:r>
@@ -22682,8 +22682,8 @@
         <w:i/>
         <w:iCs/>
         <w:color w:val="404040"/>
-        <w:sz w:val="22"/>
-        <w:szCs w:val="22"/>
+        <w:sz w:val="24"/>
+        <w:szCs w:val="24"/>
       </w:rPr>
       <w:tab/>
       <w:t xml:space="preserve">Trang </w:t>
@@ -22695,8 +22695,8 @@
         <w:i/>
         <w:iCs/>
         <w:color w:val="404040"/>
-        <w:sz w:val="22"/>
-        <w:szCs w:val="22"/>
+        <w:sz w:val="24"/>
+        <w:szCs w:val="24"/>
       </w:rPr>
       <w:fldChar w:fldCharType="begin"/>
     </w:r>
@@ -22707,8 +22707,8 @@
         <w:i/>
         <w:iCs/>
         <w:color w:val="404040"/>
-        <w:sz w:val="22"/>
-        <w:szCs w:val="22"/>
+        <w:sz w:val="24"/>
+        <w:szCs w:val="24"/>
       </w:rPr>
       <w:instrText xml:space="preserve"> PAGE </w:instrText>
     </w:r>
@@ -22719,8 +22719,8 @@
         <w:i/>
         <w:iCs/>
         <w:color w:val="404040"/>
-        <w:sz w:val="22"/>
-        <w:szCs w:val="22"/>
+        <w:sz w:val="24"/>
+        <w:szCs w:val="24"/>
       </w:rPr>
       <w:fldChar w:fldCharType="separate"/>
     </w:r>
@@ -22731,8 +22731,8 @@
         <w:i/>
         <w:iCs/>
         <w:color w:val="404040"/>
-        <w:sz w:val="22"/>
-        <w:szCs w:val="22"/>
+        <w:sz w:val="24"/>
+        <w:szCs w:val="24"/>
       </w:rPr>
       <w:t>1</w:t>
     </w:r>
@@ -22743,8 +22743,8 @@
         <w:i/>
         <w:iCs/>
         <w:color w:val="404040"/>
-        <w:sz w:val="22"/>
-        <w:szCs w:val="22"/>
+        <w:sz w:val="24"/>
+        <w:szCs w:val="24"/>
       </w:rPr>
       <w:fldChar w:fldCharType="end"/>
     </w:r>
@@ -22800,8 +22800,8 @@
         <w:i/>
         <w:iCs/>
         <w:color w:val="404040"/>
-        <w:sz w:val="22"/>
-        <w:szCs w:val="22"/>
+        <w:sz w:val="24"/>
+        <w:szCs w:val="24"/>
       </w:rPr>
       <w:t>KHBD-TOÁN10</w:t>
     </w:r>
@@ -22812,8 +22812,8 @@
         <w:i/>
         <w:iCs/>
         <w:color w:val="404040"/>
-        <w:sz w:val="22"/>
-        <w:szCs w:val="22"/>
+        <w:sz w:val="24"/>
+        <w:szCs w:val="24"/>
       </w:rPr>
       <w:tab/>
       <w:t>Năm học 2026-2027</w:t>
@@ -23108,10 +23108,10 @@
   <w:docDefaults>
     <w:rPrDefault>
       <w:rPr>
-        <w:rFonts w:ascii="Times New Roman" w:eastAsia="Times New Roman" w:hAnsi="Times New Roman" w:cs="Times New Roman"/>
-        <w:sz w:val="26"/>
-        <w:szCs w:val="26"/>
+        <w:rFonts w:ascii="Times New Roman" w:hAnsi="Times New Roman" w:eastAsia="Times New Roman" w:cs="Times New Roman"/>
         <w:lang w:val="en-GB" w:eastAsia="en-GB" w:bidi="ar-SA"/>
+        <w:sz w:val="24"/>
+        <w:szCs w:val="24"/>
       </w:rPr>
     </w:rPrDefault>
     <w:pPrDefault/>
@@ -23507,8 +23507,8 @@
     </w:pPr>
     <w:rPr>
       <w:color w:val="2E74B5"/>
-      <w:sz w:val="32"/>
-      <w:szCs w:val="32"/>
+      <w:sz w:val="24"/>
+      <w:szCs w:val="24"/>
     </w:rPr>
   </w:style>
   <w:style w:type="paragraph" w:styleId="Heading2">
@@ -23612,8 +23612,8 @@
     <w:uiPriority w:val="10"/>
     <w:qFormat/>
     <w:rPr>
-      <w:sz w:val="56"/>
-      <w:szCs w:val="56"/>
+      <w:sz w:val="24"/>
+      <w:szCs w:val="24"/>
     </w:rPr>
   </w:style>
   <w:style w:type="paragraph" w:customStyle="1" w:styleId="Strong1">
@@ -23653,8 +23653,8 @@
     <w:semiHidden/>
     <w:unhideWhenUsed/>
     <w:rPr>
-      <w:sz w:val="20"/>
-      <w:szCs w:val="20"/>
+      <w:sz w:val="24"/>
+      <w:szCs w:val="24"/>
     </w:rPr>
   </w:style>
   <w:style w:type="character" w:customStyle="1" w:styleId="FootnoteTextChar">
@@ -23664,8 +23664,8 @@
     <w:semiHidden/>
     <w:unhideWhenUsed/>
     <w:rPr>
-      <w:sz w:val="20"/>
-      <w:szCs w:val="20"/>
+      <w:sz w:val="24"/>
+      <w:szCs w:val="24"/>
     </w:rPr>
   </w:style>
   <w:style w:type="character" w:styleId="EndnoteReference">
@@ -23684,8 +23684,8 @@
     <w:semiHidden/>
     <w:unhideWhenUsed/>
     <w:rPr>
-      <w:sz w:val="20"/>
-      <w:szCs w:val="20"/>
+      <w:sz w:val="24"/>
+      <w:szCs w:val="24"/>
     </w:rPr>
   </w:style>
   <w:style w:type="character" w:customStyle="1" w:styleId="EndnoteTextChar">
@@ -23695,8 +23695,8 @@
     <w:semiHidden/>
     <w:unhideWhenUsed/>
     <w:rPr>
-      <w:sz w:val="20"/>
-      <w:szCs w:val="20"/>
+      <w:sz w:val="24"/>
+      <w:szCs w:val="24"/>
     </w:rPr>
   </w:style>
 </w:styles>

</xml_diff>